<commit_message>
formatting changes to the reports
</commit_message>
<xml_diff>
--- a/lab1/Lab1-2_InaPancenco_FAF-242.docx
+++ b/lab1/Lab1-2_InaPancenco_FAF-242.docx
@@ -146,15 +146,6 @@
         <w:spacing w:line="360" w:lineRule="auto"/>
         <w:jc w:val="center"/>
       </w:pPr>
-      <w:r>
-        <w:rPr>
-          <w:b/>
-          <w:bCs/>
-          <w:sz w:val="26"/>
-          <w:szCs w:val="26"/>
-        </w:rPr>
-        <w:t>Ina Pancenco FAF-242</w:t>
-      </w:r>
     </w:p>
     <w:p>
       <w:pPr>
@@ -245,8 +236,13 @@
         <w:jc w:val="right"/>
       </w:pPr>
       <w:r>
-        <w:t>Checked by:</w:t>
-      </w:r>
+        <w:t xml:space="preserve">Done </w:t>
+      </w:r>
+      <w:proofErr w:type="gramStart"/>
+      <w:r>
+        <w:t>by:</w:t>
+      </w:r>
+      <w:proofErr w:type="gramEnd"/>
     </w:p>
     <w:p>
       <w:pPr>
@@ -257,15 +253,28 @@
         <w:rPr>
           <w:b/>
           <w:bCs/>
-          <w:highlight w:val="yellow"/>
-        </w:rPr>
-        <w:t>[</w:t>
-      </w:r>
-      <w:r>
-        <w:rPr>
-          <w:b/>
-          <w:bCs/>
-          <w:highlight w:val="yellow"/>
+        </w:rPr>
+        <w:t>st. gr. FAF-242, Ina Pancenco</w:t>
+      </w:r>
+    </w:p>
+    <w:p>
+      <w:pPr>
+        <w:spacing w:line="360" w:lineRule="auto"/>
+        <w:jc w:val="right"/>
+      </w:pPr>
+      <w:r>
+        <w:t>Checked by:</w:t>
+      </w:r>
+    </w:p>
+    <w:p>
+      <w:pPr>
+        <w:spacing w:line="360" w:lineRule="auto"/>
+        <w:jc w:val="right"/>
+      </w:pPr>
+      <w:r>
+        <w:rPr>
+          <w:b/>
+          <w:bCs/>
         </w:rPr>
         <w:t>Rei</w:t>
       </w:r>
@@ -274,7 +283,6 @@
         <w:rPr>
           <w:b/>
           <w:bCs/>
-          <w:highlight w:val="yellow"/>
           <w:lang w:val="ro-RO"/>
         </w:rPr>
         <w:t>țman</w:t>
@@ -284,7 +292,6 @@
         <w:rPr>
           <w:b/>
           <w:bCs/>
-          <w:highlight w:val="yellow"/>
           <w:lang w:val="ro-RO"/>
         </w:rPr>
         <w:t xml:space="preserve"> Patricia</w:t>
@@ -293,7 +300,6 @@
         <w:rPr>
           <w:b/>
           <w:bCs/>
-          <w:highlight w:val="yellow"/>
         </w:rPr>
         <w:t xml:space="preserve">, </w:t>
       </w:r>
@@ -311,18 +317,8 @@
         <w:jc w:val="right"/>
       </w:pPr>
       <w:r>
-        <w:t xml:space="preserve"> FCIM, UTM</w:t>
-      </w:r>
-    </w:p>
-    <w:p>
-      <w:pPr>
-        <w:spacing w:line="360" w:lineRule="auto"/>
-      </w:pPr>
-    </w:p>
-    <w:p>
-      <w:pPr>
-        <w:spacing w:line="360" w:lineRule="auto"/>
-      </w:pPr>
+        <w:t>DISA, FCIM, UTM</w:t>
+      </w:r>
     </w:p>
     <w:p>
       <w:pPr>
@@ -624,19 +620,8 @@
           <w:sz w:val="22"/>
           <w:szCs w:val="22"/>
         </w:rPr>
-        <w:t xml:space="preserve">2.6 Kernel space, user space and system </w:t>
-      </w:r>
-      <w:proofErr w:type="gramStart"/>
-      <w:r>
-        <w:rPr>
-          <w:b/>
-          <w:bCs/>
-          <w:sz w:val="22"/>
-          <w:szCs w:val="22"/>
-        </w:rPr>
-        <w:t>calls</w:t>
-      </w:r>
-      <w:proofErr w:type="gramEnd"/>
+        <w:t>2.6 Kernel space, user space and system calls</w:t>
+      </w:r>
       <w:r>
         <w:rPr>
           <w:sz w:val="22"/>
@@ -2621,7 +2606,7 @@
           <w:sz w:val="22"/>
           <w:szCs w:val="22"/>
         </w:rPr>
-        <w:t xml:space="preserve">Figure 3.1. Creating the working folder and running </w:t>
+        <w:t xml:space="preserve">Figure 3.1 – Creating the working folder and running </w:t>
       </w:r>
       <w:proofErr w:type="spellStart"/>
       <w:r>
@@ -2732,7 +2717,7 @@
           <w:sz w:val="22"/>
           <w:szCs w:val="22"/>
         </w:rPr>
-        <w:t xml:space="preserve">Figure 3.2. Kernel information reported by </w:t>
+        <w:t xml:space="preserve">Figure 3.2 – Kernel information reported by </w:t>
       </w:r>
       <w:proofErr w:type="spellStart"/>
       <w:r>
@@ -2855,7 +2840,7 @@
           <w:sz w:val="22"/>
           <w:szCs w:val="22"/>
         </w:rPr>
-        <w:t>Figure 3.3. System uptime and load average</w:t>
+        <w:t>Figure 3.3 – System uptime and load average</w:t>
       </w:r>
     </w:p>
     <w:p>
@@ -3082,7 +3067,7 @@
           <w:sz w:val="22"/>
           <w:szCs w:val="22"/>
         </w:rPr>
-        <w:t>Figure 3.4. Contents of the root directory (ls -la /)</w:t>
+        <w:t>Figure 3.4 – Contents of the root directory (ls -la /)</w:t>
       </w:r>
     </w:p>
     <w:p>
@@ -3216,7 +3201,7 @@
           <w:sz w:val="22"/>
           <w:szCs w:val="22"/>
         </w:rPr>
-        <w:t>Figure 3.5. Contents of the home directory (ls -la ~)</w:t>
+        <w:t>Figure 3.5 – Contents of the home directory (ls -la ~)</w:t>
       </w:r>
     </w:p>
     <w:p>
@@ -3328,7 +3313,7 @@
           <w:sz w:val="22"/>
           <w:szCs w:val="22"/>
         </w:rPr>
-        <w:t>Figure 3.6. First entries of the /</w:t>
+        <w:t>Figure 3.6 – First entries of the /</w:t>
       </w:r>
       <w:proofErr w:type="spellStart"/>
       <w:r>
@@ -3620,7 +3605,7 @@
           <w:sz w:val="22"/>
           <w:szCs w:val="22"/>
         </w:rPr>
-        <w:t>Figure 3.7. Creating the demo directory</w:t>
+        <w:t>Figure 3.7 – Creating the demo directory</w:t>
       </w:r>
     </w:p>
     <w:p>
@@ -3685,27 +3670,7 @@
           <w:sz w:val="22"/>
           <w:szCs w:val="22"/>
         </w:rPr>
-        <w:t xml:space="preserve">Figure 3.8. The new </w:t>
-      </w:r>
-      <w:proofErr w:type="gramStart"/>
-      <w:r>
-        <w:rPr>
-          <w:b/>
-          <w:bCs/>
-          <w:sz w:val="22"/>
-          <w:szCs w:val="22"/>
-        </w:rPr>
-        <w:t>demo directory</w:t>
-      </w:r>
-      <w:proofErr w:type="gramEnd"/>
-      <w:r>
-        <w:rPr>
-          <w:b/>
-          <w:bCs/>
-          <w:sz w:val="22"/>
-          <w:szCs w:val="22"/>
-        </w:rPr>
-        <w:t xml:space="preserve"> seen from the Windows File Explorer</w:t>
+        <w:t>Figure 3.8 – The new demo directory seen from the Windows File Explorer</w:t>
       </w:r>
     </w:p>
     <w:p>
@@ -3780,7 +3745,7 @@
           <w:sz w:val="22"/>
           <w:szCs w:val="22"/>
         </w:rPr>
-        <w:t>Figure 3.9. Creating note.txt through output redirection</w:t>
+        <w:t>Figure 3.9 – Creating note.txt through output redirection</w:t>
       </w:r>
     </w:p>
     <w:p>
@@ -3855,7 +3820,7 @@
           <w:sz w:val="22"/>
           <w:szCs w:val="22"/>
         </w:rPr>
-        <w:t>Figure 3.10. Contents of note.txt opened in Notepad</w:t>
+        <w:t>Figure 3.10 – Contents of note.txt opened in Notepad</w:t>
       </w:r>
     </w:p>
     <w:p>
@@ -3920,7 +3885,7 @@
           <w:sz w:val="22"/>
           <w:szCs w:val="22"/>
         </w:rPr>
-        <w:t>Figure 3.11. Copying note.txt to copy.txt</w:t>
+        <w:t>Figure 3.11 – Copying note.txt to copy.txt</w:t>
       </w:r>
     </w:p>
     <w:p>
@@ -3985,7 +3950,7 @@
           <w:sz w:val="22"/>
           <w:szCs w:val="22"/>
         </w:rPr>
-        <w:t>Figure 3.12. Both note.txt and copy.txt present in the demo folder</w:t>
+        <w:t>Figure 3.12 – Both note.txt and copy.txt present in the demo folder</w:t>
       </w:r>
     </w:p>
     <w:p>
@@ -4088,7 +4053,7 @@
           <w:sz w:val="22"/>
           <w:szCs w:val="22"/>
         </w:rPr>
-        <w:t>Figure 3.13. copy.txt renamed to renamed.txt with mv</w:t>
+        <w:t>Figure 3.13 – copy.txt renamed to renamed.txt with mv</w:t>
       </w:r>
     </w:p>
     <w:p>
@@ -4153,7 +4118,7 @@
           <w:sz w:val="22"/>
           <w:szCs w:val="22"/>
         </w:rPr>
-        <w:t>Figure 3.14. Listing the directory and removing renamed.txt</w:t>
+        <w:t>Figure 3.14 – Listing the directory and removing renamed.txt</w:t>
       </w:r>
     </w:p>
     <w:p>
@@ -4401,7 +4366,7 @@
           <w:sz w:val="22"/>
           <w:szCs w:val="22"/>
         </w:rPr>
-        <w:t xml:space="preserve">Figure 3.15. Changing the permissions of note.txt with </w:t>
+        <w:t xml:space="preserve">Figure 3.15 – Changing the permissions of note.txt with </w:t>
       </w:r>
       <w:proofErr w:type="spellStart"/>
       <w:r>
@@ -4529,12 +4494,6 @@
         <w:gridCol w:w="10206"/>
       </w:tblGrid>
       <w:tr>
-        <w:tblPrEx>
-          <w:tblCellMar>
-            <w:top w:w="0" w:type="dxa"/>
-            <w:bottom w:w="0" w:type="dxa"/>
-          </w:tblCellMar>
-        </w:tblPrEx>
         <w:tc>
           <w:tcPr>
             <w:tcW w:w="10206" w:type="dxa"/>
@@ -4659,6 +4618,7 @@
           <w:b/>
           <w:bCs/>
         </w:rPr>
+        <w:lastRenderedPageBreak/>
         <w:t>(1) Owner and group of the created files</w:t>
       </w:r>
     </w:p>
@@ -5191,7 +5151,7 @@
           <w:sz w:val="22"/>
           <w:szCs w:val="22"/>
         </w:rPr>
-        <w:t xml:space="preserve">Figure 3.16. First processes in the </w:t>
+        <w:t xml:space="preserve">Figure 3.16 – First processes in the </w:t>
       </w:r>
       <w:proofErr w:type="spellStart"/>
       <w:r>
@@ -5376,7 +5336,7 @@
           <w:sz w:val="22"/>
           <w:szCs w:val="22"/>
         </w:rPr>
-        <w:t>Figure 3.17. Live process view in top</w:t>
+        <w:t>Figure 3.17 – Live process view in top</w:t>
       </w:r>
     </w:p>
     <w:p>
@@ -5995,7 +5955,7 @@
           <w:sz w:val="22"/>
           <w:szCs w:val="22"/>
         </w:rPr>
-        <w:t>Figure 3.18. Terminating the background sleep process with kill</w:t>
+        <w:t>Figure 3.18 – Terminating the background sleep process with kill</w:t>
       </w:r>
     </w:p>
     <w:p>
@@ -6219,7 +6179,7 @@
           <w:sz w:val="22"/>
           <w:szCs w:val="22"/>
         </w:rPr>
-        <w:t>Figure 3.19. Starting a new sleep process and storing its PID</w:t>
+        <w:t>Figure 3.19 – Starting a new sleep process and storing its PID</w:t>
       </w:r>
     </w:p>
     <w:p>
@@ -6294,7 +6254,7 @@
           <w:sz w:val="22"/>
           <w:szCs w:val="22"/>
         </w:rPr>
-        <w:t>Figure 3.20. Contents of the /proc/941 directory</w:t>
+        <w:t>Figure 3.20 – Contents of the /proc/941 directory</w:t>
       </w:r>
     </w:p>
     <w:p>
@@ -6402,7 +6362,7 @@
           <w:sz w:val="22"/>
           <w:szCs w:val="22"/>
         </w:rPr>
-        <w:t>Figure 3.21. The first 20 lines of /proc/941/status</w:t>
+        <w:t>Figure 3.21 – The first 20 lines of /proc/941/status</w:t>
       </w:r>
     </w:p>
     <w:p>
@@ -6631,12 +6591,6 @@
         <w:gridCol w:w="10206"/>
       </w:tblGrid>
       <w:tr>
-        <w:tblPrEx>
-          <w:tblCellMar>
-            <w:top w:w="0" w:type="dxa"/>
-            <w:bottom w:w="0" w:type="dxa"/>
-          </w:tblCellMar>
-        </w:tblPrEx>
         <w:tc>
           <w:tcPr>
             <w:tcW w:w="10206" w:type="dxa"/>
@@ -7231,27 +7185,7 @@
           <w:sz w:val="22"/>
           <w:szCs w:val="22"/>
         </w:rPr>
-        <w:t>Figure 3.22. Memory usage (</w:t>
-      </w:r>
-      <w:proofErr w:type="gramStart"/>
-      <w:r>
-        <w:rPr>
-          <w:b/>
-          <w:bCs/>
-          <w:sz w:val="22"/>
-          <w:szCs w:val="22"/>
-        </w:rPr>
-        <w:t>free -h</w:t>
-      </w:r>
-      <w:proofErr w:type="gramEnd"/>
-      <w:r>
-        <w:rPr>
-          <w:b/>
-          <w:bCs/>
-          <w:sz w:val="22"/>
-          <w:szCs w:val="22"/>
-        </w:rPr>
-        <w:t>, /proc/</w:t>
+        <w:t>Figure 3.22 – Memory usage (free -h, /proc/</w:t>
       </w:r>
       <w:proofErr w:type="spellStart"/>
       <w:r>
@@ -7391,12 +7325,6 @@
         <w:gridCol w:w="10206"/>
       </w:tblGrid>
       <w:tr>
-        <w:tblPrEx>
-          <w:tblCellMar>
-            <w:top w:w="0" w:type="dxa"/>
-            <w:bottom w:w="0" w:type="dxa"/>
-          </w:tblCellMar>
-        </w:tblPrEx>
         <w:tc>
           <w:tcPr>
             <w:tcW w:w="10206" w:type="dxa"/>
@@ -7945,7 +7873,7 @@
           <w:sz w:val="22"/>
           <w:szCs w:val="22"/>
         </w:rPr>
-        <w:t>Figure 3.23. Mounted filesystems and their free space (</w:t>
+        <w:t>Figure 3.23 – Mounted filesystems and their free space (</w:t>
       </w:r>
       <w:proofErr w:type="spellStart"/>
       <w:r>
@@ -8123,7 +8051,7 @@
           <w:sz w:val="22"/>
           <w:szCs w:val="22"/>
         </w:rPr>
-        <w:t>Figure 3.24. Block devices (</w:t>
+        <w:t>Figure 3.24 – Block devices (</w:t>
       </w:r>
       <w:proofErr w:type="spellStart"/>
       <w:r>
@@ -8310,7 +8238,7 @@
           <w:sz w:val="22"/>
           <w:szCs w:val="22"/>
         </w:rPr>
-        <w:t>Figure 3.25. The first mounted filesystems as reported by mount</w:t>
+        <w:t>Figure 3.25 – The first mounted filesystems as reported by mount</w:t>
       </w:r>
     </w:p>
     <w:p>
@@ -8395,12 +8323,6 @@
         <w:gridCol w:w="10206"/>
       </w:tblGrid>
       <w:tr>
-        <w:tblPrEx>
-          <w:tblCellMar>
-            <w:top w:w="0" w:type="dxa"/>
-            <w:bottom w:w="0" w:type="dxa"/>
-          </w:tblCellMar>
-        </w:tblPrEx>
         <w:tc>
           <w:tcPr>
             <w:tcW w:w="10206" w:type="dxa"/>
@@ -8983,7 +8905,7 @@
           <w:sz w:val="22"/>
           <w:szCs w:val="22"/>
         </w:rPr>
-        <w:t>Figure 4.1. Cloning the xv6-riscv repository</w:t>
+        <w:t>Figure 4.1 – Cloning the xv6-riscv repository</w:t>
       </w:r>
     </w:p>
     <w:p>
@@ -9001,18 +8923,13 @@
       </w:r>
       <w:proofErr w:type="spellEnd"/>
       <w:r>
-        <w:t xml:space="preserve"> (a host tool that builds the xv6 disk image), </w:t>
-      </w:r>
-      <w:proofErr w:type="gramStart"/>
-      <w:r>
-        <w:t xml:space="preserve">the </w:t>
+        <w:t xml:space="preserve"> (a host tool that builds the xv6 disk image), the </w:t>
       </w:r>
       <w:proofErr w:type="spellStart"/>
       <w:r>
         <w:t>Makefile</w:t>
       </w:r>
       <w:proofErr w:type="spellEnd"/>
-      <w:proofErr w:type="gramEnd"/>
       <w:r>
         <w:t>, the README, the LICENSE and a test script.</w:t>
       </w:r>
@@ -9591,7 +9508,7 @@
           <w:sz w:val="22"/>
           <w:szCs w:val="22"/>
         </w:rPr>
-        <w:t>Figure 4.2. Building xv6 and booting it in QEMU</w:t>
+        <w:t>Figure 4.2 – Building xv6 and booting it in QEMU</w:t>
       </w:r>
     </w:p>
     <w:p>
@@ -10128,7 +10045,7 @@
           <w:sz w:val="22"/>
           <w:szCs w:val="22"/>
         </w:rPr>
-        <w:t>Figure 4.3. Contents of the xv6 root directory</w:t>
+        <w:t>Figure 4.3 – Contents of the xv6 root directory</w:t>
       </w:r>
     </w:p>
     <w:p>
@@ -10223,7 +10140,7 @@
           <w:sz w:val="22"/>
           <w:szCs w:val="22"/>
         </w:rPr>
-        <w:t>Figure 4.4. The xv6 README displayed with cat</w:t>
+        <w:t>Figure 4.4 – The xv6 README displayed with cat</w:t>
       </w:r>
     </w:p>
     <w:p>
@@ -10298,7 +10215,7 @@
           <w:sz w:val="22"/>
           <w:szCs w:val="22"/>
         </w:rPr>
-        <w:t xml:space="preserve">Figure 4.5. echo, a pipe between ls and grep, and </w:t>
+        <w:t xml:space="preserve">Figure 4.5 – echo, a pipe between ls and grep, and </w:t>
       </w:r>
       <w:proofErr w:type="spellStart"/>
       <w:r>
@@ -10452,7 +10369,7 @@
           <w:sz w:val="22"/>
           <w:szCs w:val="22"/>
         </w:rPr>
-        <w:t>Figure 4.6. Running the xv6 kernel test suite (</w:t>
+        <w:t>Figure 4.6 – Running the xv6 kernel test suite (</w:t>
       </w:r>
       <w:proofErr w:type="spellStart"/>
       <w:r>
@@ -10668,12 +10585,6 @@
         <w:gridCol w:w="10206"/>
       </w:tblGrid>
       <w:tr>
-        <w:tblPrEx>
-          <w:tblCellMar>
-            <w:top w:w="0" w:type="dxa"/>
-            <w:bottom w:w="0" w:type="dxa"/>
-          </w:tblCellMar>
-        </w:tblPrEx>
         <w:tc>
           <w:tcPr>
             <w:tcW w:w="10206" w:type="dxa"/>
@@ -11114,7 +11025,7 @@
           <w:sz w:val="22"/>
           <w:szCs w:val="22"/>
         </w:rPr>
-        <w:t>Figure 4.7. The beginning of user/</w:t>
+        <w:t>Figure 4.7 – The beginning of user/</w:t>
       </w:r>
       <w:proofErr w:type="spellStart"/>
       <w:r>
@@ -12168,7 +12079,7 @@
           <w:sz w:val="22"/>
           <w:szCs w:val="22"/>
         </w:rPr>
-        <w:t>Figure 4.8. user/</w:t>
+        <w:t>Figure 4.8 – user/</w:t>
       </w:r>
       <w:proofErr w:type="spellStart"/>
       <w:r>
@@ -12361,7 +12272,7 @@
           <w:sz w:val="22"/>
           <w:szCs w:val="22"/>
         </w:rPr>
-        <w:t xml:space="preserve">Figure 4.9. Locating </w:t>
+        <w:t xml:space="preserve">Figure 4.9 – Locating </w:t>
       </w:r>
       <w:proofErr w:type="spellStart"/>
       <w:r>
@@ -12496,12 +12407,6 @@
         <w:gridCol w:w="10206"/>
       </w:tblGrid>
       <w:tr>
-        <w:tblPrEx>
-          <w:tblCellMar>
-            <w:top w:w="0" w:type="dxa"/>
-            <w:bottom w:w="0" w:type="dxa"/>
-          </w:tblCellMar>
-        </w:tblPrEx>
         <w:tc>
           <w:tcPr>
             <w:tcW w:w="10206" w:type="dxa"/>
@@ -13703,7 +13608,7 @@
           <w:sz w:val="22"/>
           <w:szCs w:val="22"/>
         </w:rPr>
-        <w:t>Figure 4.10. Creating user/</w:t>
+        <w:t>Figure 4.10 – Creating user/</w:t>
       </w:r>
       <w:proofErr w:type="spellStart"/>
       <w:r>
@@ -13860,7 +13765,7 @@
           <w:sz w:val="22"/>
           <w:szCs w:val="22"/>
         </w:rPr>
-        <w:t xml:space="preserve">Figure 4.11. The xv6 </w:t>
+        <w:t xml:space="preserve">Figure 4.11 – The xv6 </w:t>
       </w:r>
       <w:proofErr w:type="spellStart"/>
       <w:r>
@@ -14168,7 +14073,7 @@
           <w:sz w:val="22"/>
           <w:szCs w:val="22"/>
         </w:rPr>
-        <w:t>Figure 4.12. The new entry $U/_sleep added to the UPROGS list</w:t>
+        <w:t>Figure 4.12 – The new entry $U/_sleep added to the UPROGS list</w:t>
       </w:r>
     </w:p>
     <w:p>
@@ -15222,7 +15127,7 @@
           <w:sz w:val="20"/>
           <w:szCs w:val="20"/>
         </w:rPr>
-        <w:t>$ sleep 10     # should pause about one second, then return to the prompt</w:t>
+        <w:t>$ sleep 10     # pauses for 10 ticks, then the prompt returns</w:t>
       </w:r>
     </w:p>
     <w:p>
@@ -15241,93 +15146,7 @@
           <w:sz w:val="20"/>
           <w:szCs w:val="20"/>
         </w:rPr>
-        <w:t xml:space="preserve">$ sleep        # should </w:t>
-      </w:r>
-      <w:proofErr w:type="gramStart"/>
-      <w:r>
-        <w:rPr>
-          <w:rFonts w:ascii="Consolas" w:eastAsia="Consolas" w:hAnsi="Consolas" w:cs="Consolas"/>
-          <w:sz w:val="20"/>
-          <w:szCs w:val="20"/>
-        </w:rPr>
-        <w:t>print:</w:t>
-      </w:r>
-      <w:proofErr w:type="gramEnd"/>
-      <w:r>
-        <w:rPr>
-          <w:rFonts w:ascii="Consolas" w:eastAsia="Consolas" w:hAnsi="Consolas" w:cs="Consolas"/>
-          <w:sz w:val="20"/>
-          <w:szCs w:val="20"/>
-        </w:rPr>
-        <w:t xml:space="preserve"> usage: sleep &lt;ticks&gt;</w:t>
-      </w:r>
-    </w:p>
-    <w:p>
-      <w:pPr>
-        <w:spacing w:before="120" w:after="200"/>
-        <w:jc w:val="center"/>
-      </w:pPr>
-      <w:r>
-        <w:rPr>
-          <w:i/>
-          <w:iCs/>
-          <w:highlight w:val="yellow"/>
-        </w:rPr>
-        <w:t xml:space="preserve">[Screenshot </w:t>
-      </w:r>
-      <w:proofErr w:type="gramStart"/>
-      <w:r>
-        <w:rPr>
-          <w:i/>
-          <w:iCs/>
-          <w:highlight w:val="yellow"/>
-        </w:rPr>
-        <w:t>pending:</w:t>
-      </w:r>
-      <w:proofErr w:type="gramEnd"/>
-      <w:r>
-        <w:rPr>
-          <w:i/>
-          <w:iCs/>
-          <w:highlight w:val="yellow"/>
-        </w:rPr>
-        <w:t xml:space="preserve"> make </w:t>
-      </w:r>
-      <w:proofErr w:type="spellStart"/>
-      <w:r>
-        <w:rPr>
-          <w:i/>
-          <w:iCs/>
-          <w:highlight w:val="yellow"/>
-        </w:rPr>
-        <w:t>qemu</w:t>
-      </w:r>
-      <w:proofErr w:type="spellEnd"/>
-      <w:r>
-        <w:rPr>
-          <w:i/>
-          <w:iCs/>
-          <w:highlight w:val="yellow"/>
-        </w:rPr>
-        <w:t xml:space="preserve"> with the corrected </w:t>
-      </w:r>
-      <w:proofErr w:type="spellStart"/>
-      <w:r>
-        <w:rPr>
-          <w:i/>
-          <w:iCs/>
-          <w:highlight w:val="yellow"/>
-        </w:rPr>
-        <w:t>sleep.c</w:t>
-      </w:r>
-      <w:proofErr w:type="spellEnd"/>
-      <w:r>
-        <w:rPr>
-          <w:i/>
-          <w:iCs/>
-          <w:highlight w:val="yellow"/>
-        </w:rPr>
-        <w:t>, then "sleep 10" and "sleep" at the xv6 $ prompt]</w:t>
+        <w:t>$ sleep        # prints: usage: sleep &lt;ticks&gt;</w:t>
       </w:r>
     </w:p>
     <w:p>
@@ -15359,11 +15178,7 @@
         <w:t>sleep</w:t>
       </w:r>
       <w:r>
-        <w:t xml:space="preserve"> without an argument prints the usage message. Note that the test </w:t>
-      </w:r>
-      <w:r>
-        <w:lastRenderedPageBreak/>
-        <w:t xml:space="preserve">must be run at the xv6 prompt inside QEMU: typing </w:t>
+        <w:t xml:space="preserve"> without an argument prints the usage message. Note that the test must be run at the xv6 prompt inside QEMU: typing </w:t>
       </w:r>
       <w:r>
         <w:rPr>
@@ -15722,9 +15537,61 @@
         <w:t>Microsoft. (2025). Windows Subsystem for Linux documentation. Retrieved from https://learn.microsoft.com/windows/wsl/</w:t>
       </w:r>
     </w:p>
+    <w:p>
+      <w:pPr>
+        <w:pStyle w:val="Listparagraf"/>
+        <w:numPr>
+          <w:ilvl w:val="0"/>
+          <w:numId w:val="3"/>
+        </w:numPr>
+        <w:spacing w:line="360" w:lineRule="auto"/>
+        <w:jc w:val="both"/>
+      </w:pPr>
+      <w:r>
+        <w:t xml:space="preserve">Pancenco, I. (2026). os-2026-InaPancenco: source code and reports of the Operating Systems laboratory </w:t>
+      </w:r>
+      <w:proofErr w:type="gramStart"/>
+      <w:r>
+        <w:t>works</w:t>
+      </w:r>
+      <w:proofErr w:type="gramEnd"/>
+      <w:r>
+        <w:t xml:space="preserve"> GitHub repository. Retrieved from</w:t>
+      </w:r>
+      <w:r>
+        <w:t>:</w:t>
+      </w:r>
+      <w:r>
+        <w:t xml:space="preserve"> </w:t>
+      </w:r>
+      <w:hyperlink r:id="rId46" w:history="1">
+        <w:r>
+          <w:rPr>
+            <w:rStyle w:val="Hyperlink"/>
+          </w:rPr>
+          <w:t>https://github.com/inap235/os-2026-InaPancenco</w:t>
+        </w:r>
+      </w:hyperlink>
+    </w:p>
+    <w:p>
+      <w:pPr>
+        <w:pStyle w:val="Listparagraf"/>
+        <w:spacing w:line="360" w:lineRule="auto"/>
+        <w:ind w:left="720"/>
+        <w:jc w:val="both"/>
+      </w:pPr>
+    </w:p>
+    <w:p>
+      <w:pPr>
+        <w:pStyle w:val="Listparagraf"/>
+        <w:spacing w:line="360" w:lineRule="auto"/>
+        <w:ind w:left="720"/>
+        <w:jc w:val="both"/>
+      </w:pPr>
+    </w:p>
     <w:sectPr>
-      <w:footerReference w:type="default" r:id="rId46"/>
-      <w:footerReference w:type="first" r:id="rId47"/>
+      <w:footerReference w:type="default" r:id="rId47"/>
+      <w:footerReference w:type="first" r:id="rId48"/>
       <w:pgSz w:w="11907" w:h="16840"/>
       <w:pgMar w:top="1134" w:right="567" w:bottom="1134" w:left="1134" w:header="709" w:footer="709" w:gutter="0"/>
       <w:cols w:space="720"/>
@@ -16694,6 +16561,30 @@
       <w:szCs w:val="20"/>
     </w:rPr>
   </w:style>
+  <w:style w:type="character" w:styleId="MeniuneNerezolvat">
+    <w:name w:val="Unresolved Mention"/>
+    <w:basedOn w:val="Fontdeparagrafimplicit"/>
+    <w:uiPriority w:val="99"/>
+    <w:semiHidden/>
+    <w:unhideWhenUsed/>
+    <w:rsid w:val="00932382"/>
+    <w:rPr>
+      <w:color w:val="605E5C"/>
+      <w:shd w:val="clear" w:color="auto" w:fill="E1DFDD"/>
+    </w:rPr>
+  </w:style>
+  <w:style w:type="character" w:styleId="HyperlinkParcurs">
+    <w:name w:val="FollowedHyperlink"/>
+    <w:basedOn w:val="Fontdeparagrafimplicit"/>
+    <w:uiPriority w:val="99"/>
+    <w:semiHidden/>
+    <w:unhideWhenUsed/>
+    <w:rsid w:val="009E2938"/>
+    <w:rPr>
+      <w:color w:val="96607D" w:themeColor="followedHyperlink"/>
+      <w:u w:val="single"/>
+    </w:rPr>
+  </w:style>
 </w:styles>
 </file>
 

</xml_diff>

<commit_message>
Lab 2: add notes.md and sleep screenshot to report
</commit_message>
<xml_diff>
--- a/lab1/Lab1-2_InaPancenco_FAF-242.docx
+++ b/lab1/Lab1-2_InaPancenco_FAF-242.docx
@@ -15151,12 +15151,77 @@
     </w:p>
     <w:p>
       <w:pPr>
+        <w:keepNext/>
+        <w:spacing w:before="120" w:after="60"/>
+        <w:jc w:val="center"/>
+      </w:pPr>
+      <w:r>
+        <w:rPr>
+          <w:noProof/>
+        </w:rPr>
+        <w:drawing>
+          <wp:inline distT="0" distB="0" distL="0" distR="0">
+            <wp:extent cx="5400000" cy="2075251"/>
+            <wp:effectExtent l="0" t="0" r="0" b="0"/>
+            <wp:docPr id="1918563900" name="l2_sleep.png" descr="Running sleep 10 and sleep without an argument inside xv6" title="Running sleep 10 and sleep without an argument inside xv6"/>
+            <wp:cNvGraphicFramePr>
+              <a:graphicFrameLocks xmlns:a="http://schemas.openxmlformats.org/drawingml/2006/main" noChangeAspect="1"/>
+            </wp:cNvGraphicFramePr>
+            <a:graphic xmlns:a="http://schemas.openxmlformats.org/drawingml/2006/main">
+              <a:graphicData uri="http://schemas.openxmlformats.org/drawingml/2006/picture">
+                <pic:pic xmlns:pic="http://schemas.openxmlformats.org/drawingml/2006/picture">
+                  <pic:nvPicPr>
+                    <pic:cNvPr id="0" name=""/>
+                    <pic:cNvPicPr>
+                      <a:picLocks noChangeAspect="1" noChangeArrowheads="1"/>
+                    </pic:cNvPicPr>
+                  </pic:nvPicPr>
+                  <pic:blipFill>
+                    <a:blip r:embed="rId51"/>
+                    <a:srcRect/>
+                    <a:stretch>
+                      <a:fillRect/>
+                    </a:stretch>
+                  </pic:blipFill>
+                  <pic:spPr bwMode="auto">
+                    <a:xfrm>
+                      <a:off x="0" y="0"/>
+                      <a:ext cx="5400000" cy="2075251"/>
+                    </a:xfrm>
+                    <a:prstGeom prst="rect">
+                      <a:avLst/>
+                    </a:prstGeom>
+                  </pic:spPr>
+                </pic:pic>
+              </a:graphicData>
+            </a:graphic>
+          </wp:inline>
+        </w:drawing>
+      </w:r>
+    </w:p>
+    <w:p>
+      <w:pPr>
+        <w:spacing w:after="200"/>
+        <w:jc w:val="center"/>
+      </w:pPr>
+      <w:r>
+        <w:rPr>
+          <w:b/>
+          <w:bCs/>
+          <w:sz w:val="22"/>
+          <w:szCs w:val="22"/>
+        </w:rPr>
+        <w:t>Figure 4.13 – Running sleep 10 and sleep without an argument inside xv6</w:t>
+      </w:r>
+    </w:p>
+    <w:p>
+      <w:pPr>
         <w:spacing w:line="360" w:lineRule="auto"/>
         <w:ind w:firstLine="709"/>
         <w:jc w:val="both"/>
       </w:pPr>
       <w:r>
-        <w:t xml:space="preserve">With the corrected call, </w:t>
+        <w:t xml:space="preserve">With the corrected call (Figure 4.13), </w:t>
       </w:r>
       <w:r>
         <w:rPr>

</xml_diff>